<commit_message>
feat: implement owner request module with submission and status retrieval
- Add `owner_requests` module with DTOs, models, repositories, and services.
- Implement functionality to submit owner requests with document validation.
- Create endpoints for submitting owner requests and retrieving request status.
- Introduce validation for identity data and document types (images and PDFs).
- Enhance file validation with size limits for images and PDFs.
- Update OpenAPI documentation to include new endpoints and request/response schemas.
</commit_message>
<xml_diff>
--- a/docs/new-ideas.docx
+++ b/docs/new-ideas.docx
@@ -13,7 +13,7 @@
       </w:pPr>
       <w:r>
         <w:rPr>
-          <w:rFonts w:ascii="Calibri" w:cs="Calibri"/>
+          <w:rFonts w:ascii="Calibri" w:hAnsi="Calibri" w:eastAsia="Calibri" w:cs="Calibri" w:hAnsiTheme="minorHAnsi" w:eastAsiaTheme="minorHAnsi"/>
           <w:kern w:val="2"/>
           <w:sz w:val="36"/>
           <w:szCs w:val="36"/>
@@ -26,7 +26,7 @@
     <w:p>
       <w:r>
         <w:rPr>
-          <w:rFonts w:ascii="Calibri" w:cs="Calibri"/>
+          <w:rFonts w:ascii="Calibri" w:hAnsi="Calibri" w:eastAsia="Calibri" w:cs="Calibri" w:hAnsiTheme="minorHAnsi" w:eastAsiaTheme="minorHAnsi"/>
           <w:kern w:val="2"/>
           <w:sz w:val="24"/>
           <w:szCs w:val="24"/>
@@ -37,7 +37,8 @@
         <w:r>
           <w:rPr>
             <w:rStyle w:val="Hyperlink"/>
-            <w:rFonts w:ascii="Calibri" w:cs="Calibri"/>
+            <w:rFonts w:ascii="Calibri" w:hAnsi="Calibri" w:eastAsia="Calibri" w:cs="Calibri" w:hAnsiTheme="minorHAnsi" w:eastAsiaTheme="minorHAnsi"/>
+            <w:color w:val="0563C1" w:themeColor="hyperlink"/>
             <w:kern w:val="2"/>
             <w:sz w:val="24"/>
             <w:szCs w:val="24"/>
@@ -48,7 +49,7 @@
       </w:hyperlink>
       <w:r>
         <w:rPr>
-          <w:rFonts w:ascii="Calibri" w:cs="Calibri"/>
+          <w:rFonts w:ascii="Calibri" w:hAnsi="Calibri" w:eastAsia="Calibri" w:cs="Calibri" w:hAnsiTheme="minorHAnsi" w:eastAsiaTheme="minorHAnsi"/>
           <w:kern w:val="2"/>
           <w:sz w:val="24"/>
           <w:szCs w:val="24"/>
@@ -60,7 +61,7 @@
     <w:p>
       <w:r>
         <w:rPr>
-          <w:rFonts w:ascii="Calibri" w:cs="Calibri"/>
+          <w:rFonts w:ascii="Calibri" w:hAnsi="Calibri" w:eastAsia="Calibri" w:cs="Calibri" w:hAnsiTheme="minorHAnsi" w:eastAsiaTheme="minorHAnsi"/>
           <w:kern w:val="2"/>
           <w:sz w:val="24"/>
           <w:szCs w:val="24"/>
@@ -72,7 +73,7 @@
       </w:r>
       <w:r>
         <w:rPr>
-          <w:rFonts w:ascii="Calibri" w:cs="Calibri"/>
+          <w:rFonts w:ascii="Calibri" w:hAnsi="Calibri" w:eastAsia="Calibri" w:cs="Calibri" w:hAnsiTheme="minorHAnsi" w:eastAsiaTheme="minorHAnsi"/>
           <w:kern w:val="2"/>
           <w:sz w:val="24"/>
           <w:szCs w:val="24"/>
@@ -84,7 +85,7 @@
       </w:r>
       <w:r>
         <w:rPr>
-          <w:rFonts w:ascii="Calibri" w:cs="Calibri"/>
+          <w:rFonts w:ascii="Calibri" w:hAnsi="Calibri" w:eastAsia="Calibri" w:cs="Calibri" w:hAnsiTheme="minorHAnsi" w:eastAsiaTheme="minorHAnsi"/>
           <w:kern w:val="2"/>
           <w:sz w:val="24"/>
           <w:szCs w:val="24"/>
@@ -96,7 +97,7 @@
     <w:p>
       <w:r>
         <w:rPr>
-          <w:rFonts w:ascii="Calibri" w:cs="Calibri"/>
+          <w:rFonts w:ascii="Calibri" w:hAnsi="Calibri" w:eastAsia="Calibri" w:cs="Calibri" w:hAnsiTheme="minorHAnsi" w:eastAsiaTheme="minorHAnsi"/>
           <w:kern w:val="2"/>
           <w:sz w:val="24"/>
           <w:szCs w:val="24"/>
@@ -107,17 +108,45 @@
     <w:p/>
     <w:p>
       <w:r>
+        <w:rPr>
+          <w:rFonts w:ascii="Calibri" w:hAnsi="Calibri" w:eastAsia="Calibri" w:cs="Calibri" w:asciiTheme="minorHAnsi" w:hAnsiTheme="minorHAnsi" w:eastAsiaTheme="minorHAnsi" w:csTheme="minorBidi"/>
+          <w:kern w:val="2"/>
+          <w:sz w:val="24"/>
+          <w:szCs w:val="24"/>
+        </w:rPr>
         <w:t>- envoyer un email de confirmation de update du profile utilisateurs, lorsqu'un utilisateurs essayer de mette à jour ses informations.</w:t>
       </w:r>
     </w:p>
     <w:p>
       <w:r>
+        <w:rPr>
+          <w:rFonts w:ascii="Calibri" w:hAnsi="Calibri" w:eastAsia="Calibri" w:cs="Calibri" w:asciiTheme="minorHAnsi" w:hAnsiTheme="minorHAnsi" w:eastAsiaTheme="minorHAnsi" w:csTheme="minorBidi"/>
+          <w:kern w:val="2"/>
+          <w:sz w:val="24"/>
+          <w:szCs w:val="24"/>
+        </w:rPr>
         <w:t>- Dashboard admin permettant d'administrer ses biens en location (nom et contrat du locataire)</w:t>
       </w:r>
     </w:p>
     <w:p>
       <w:r>
+        <w:rPr>
+          <w:rFonts w:ascii="Calibri" w:hAnsi="Calibri" w:eastAsia="Calibri" w:cs="Calibri" w:asciiTheme="minorHAnsi" w:hAnsiTheme="minorHAnsi" w:eastAsiaTheme="minorHAnsi" w:csTheme="minorBidi"/>
+          <w:kern w:val="2"/>
+          <w:sz w:val="24"/>
+          <w:szCs w:val="24"/>
+        </w:rPr>
         <w:t>- Ajouter l'option "à vendre", "à louer" respectivement pour les biens à vendre et à louer.</w:t>
+      </w:r>
+    </w:p>
+    <w:p>
+      <w:r>
+        <w:t>- Ajouter dans le formulaire de request owner les champs "CNI number" et "Delivery date"</w:t>
+      </w:r>
+    </w:p>
+    <w:p>
+      <w:r>
+        <w:t>- Apres avoir soumit le formulaire et la requette approver, le owner peux consulter son formulaire qui sera enregister sous forme de table et lecture seul. S'il veut modifier (pour mettre pars exemple ca CNI ou autre information à jour), cela enclanchera une authentification par OTP où il devrai césir le bon code et pouvoir modifier, en suite soumettre à nouveau, une fois les updates validé, son profile se mettra à jour avec les nouvelles modifications et en mode lecture seule.</w:t>
       </w:r>
     </w:p>
     <w:sectPr>

</xml_diff>

<commit_message>
update(docs): replace new ideas document with updated version
</commit_message>
<xml_diff>
--- a/docs/new-ideas.docx
+++ b/docs/new-ideas.docx
@@ -178,6 +178,11 @@
     <w:p>
       <w:r>
         <w:t>- Ajouter l'espace Agent Immobilié à la demande. et mensionner dans la page à pros et aussi dans le pied de page le message ("si vous etes un agent immobilier, contacter nous)</w:t>
+      </w:r>
+    </w:p>
+    <w:p>
+      <w:r>
+        <w:t>- Ajouter un boutton "signaler ce bien" dans la page de détail du listing.</w:t>
       </w:r>
     </w:p>
     <w:sectPr>

</xml_diff>

<commit_message>
feat(MH-54): implement draft visibility for listings until published
- Introduced `published_at` column to manage listing visibility.
- Updated backend to ensure listings are public only if published and have at least one photo.
- Modified `GET /listings/:id` to allow optional authentication, returning 404 for non-owners of unpublished listings.
- Enhanced frontend to reflect listing states (draft, published, hidden) with appropriate messaging.
- Added necessary migrations, seeds, and updated technical specifications.
</commit_message>
<xml_diff>
--- a/docs/new-ideas.docx
+++ b/docs/new-ideas.docx
@@ -158,6 +158,11 @@
           <w:szCs w:val="24"/>
         </w:rPr>
         <w:t>- Apres avoir soumit le formulaire et la requette approver, le owner peux consulter son formulaire qui sera enregister sous forme de table et lecture seul. S'il veut modifier (pour mettre pars exemple ca CNI ou autre information à jour), cela enclanchera une authentification par OTP où il devrai césir le bon code et pouvoir modifier, en suite soumettre à nouveau, une fois les updates validé, son profile se mettra à jour avec les nouvelles modifications et en mode lecture seule.</w:t>
+      </w:r>
+    </w:p>
+    <w:p>
+      <w:r>
+        <w:t>- un owner peut planifier la disponibilit" d'un bien.</w:t>
       </w:r>
     </w:p>
     <w:p>

</xml_diff>

<commit_message>
feat: add listing photos management feature
- Implemented ListingPhotosPage for managing listing photos, including upload and deletion functionalities.
- Added DeletePhotoModal for confirming photo deletions.
- Updated router to include a new route for managing listing photos.
- Enhanced API with upload and delete functions for listing photos.
- Created hooks for managing photo mutations using React Query.
- Added validation for image files, including size and format checks.
- Updated OwnerBar to link to the new photos management page.
- Created tests for photo selection planning and error handling.
</commit_message>
<xml_diff>
--- a/docs/new-ideas.docx
+++ b/docs/new-ideas.docx
@@ -13,7 +13,7 @@
       </w:pPr>
       <w:r>
         <w:rPr>
-          <w:rFonts w:ascii="Calibri" w:cs="Calibri"/>
+          <w:rFonts w:ascii="Calibri" w:hAnsi="Calibri" w:eastAsia="Calibri" w:cs="Calibri" w:hAnsiTheme="minorHAnsi" w:eastAsiaTheme="minorHAnsi"/>
           <w:kern w:val="2"/>
           <w:sz w:val="36"/>
           <w:szCs w:val="36"/>
@@ -26,7 +26,7 @@
     <w:p>
       <w:r>
         <w:rPr>
-          <w:rFonts w:ascii="Calibri" w:cs="Calibri"/>
+          <w:rFonts w:ascii="Calibri" w:hAnsi="Calibri" w:eastAsia="Calibri" w:cs="Calibri" w:hAnsiTheme="minorHAnsi" w:eastAsiaTheme="minorHAnsi"/>
           <w:kern w:val="2"/>
           <w:sz w:val="24"/>
           <w:szCs w:val="24"/>
@@ -37,7 +37,8 @@
         <w:r>
           <w:rPr>
             <w:rStyle w:val="Hyperlink"/>
-            <w:rFonts w:ascii="Calibri" w:cs="Calibri"/>
+            <w:rFonts w:ascii="Calibri" w:hAnsi="Calibri" w:eastAsia="Calibri" w:cs="Calibri" w:hAnsiTheme="minorHAnsi" w:eastAsiaTheme="minorHAnsi"/>
+            <w:color w:val="0563C1" w:themeColor="hyperlink"/>
             <w:kern w:val="2"/>
             <w:sz w:val="24"/>
             <w:szCs w:val="24"/>
@@ -48,7 +49,7 @@
       </w:hyperlink>
       <w:r>
         <w:rPr>
-          <w:rFonts w:ascii="Calibri" w:cs="Calibri"/>
+          <w:rFonts w:ascii="Calibri" w:hAnsi="Calibri" w:eastAsia="Calibri" w:cs="Calibri" w:hAnsiTheme="minorHAnsi" w:eastAsiaTheme="minorHAnsi"/>
           <w:kern w:val="2"/>
           <w:sz w:val="24"/>
           <w:szCs w:val="24"/>
@@ -60,7 +61,7 @@
     <w:p>
       <w:r>
         <w:rPr>
-          <w:rFonts w:ascii="Calibri" w:cs="Calibri"/>
+          <w:rFonts w:ascii="Calibri" w:hAnsi="Calibri" w:eastAsia="Calibri" w:cs="Calibri" w:hAnsiTheme="minorHAnsi" w:eastAsiaTheme="minorHAnsi"/>
           <w:kern w:val="2"/>
           <w:sz w:val="24"/>
           <w:szCs w:val="24"/>
@@ -72,7 +73,7 @@
       </w:r>
       <w:r>
         <w:rPr>
-          <w:rFonts w:ascii="Calibri" w:cs="Calibri"/>
+          <w:rFonts w:ascii="Calibri" w:hAnsi="Calibri" w:eastAsia="Calibri" w:cs="Calibri" w:hAnsiTheme="minorHAnsi" w:eastAsiaTheme="minorHAnsi"/>
           <w:kern w:val="2"/>
           <w:sz w:val="24"/>
           <w:szCs w:val="24"/>
@@ -84,7 +85,7 @@
       </w:r>
       <w:r>
         <w:rPr>
-          <w:rFonts w:ascii="Calibri" w:cs="Calibri"/>
+          <w:rFonts w:ascii="Calibri" w:hAnsi="Calibri" w:eastAsia="Calibri" w:cs="Calibri" w:hAnsiTheme="minorHAnsi" w:eastAsiaTheme="minorHAnsi"/>
           <w:kern w:val="2"/>
           <w:sz w:val="24"/>
           <w:szCs w:val="24"/>
@@ -96,7 +97,7 @@
     <w:p>
       <w:r>
         <w:rPr>
-          <w:rFonts w:ascii="Calibri" w:cs="Calibri"/>
+          <w:rFonts w:ascii="Calibri" w:hAnsi="Calibri" w:eastAsia="Calibri" w:cs="Calibri" w:hAnsiTheme="minorHAnsi" w:eastAsiaTheme="minorHAnsi"/>
           <w:kern w:val="2"/>
           <w:sz w:val="24"/>
           <w:szCs w:val="24"/>
@@ -108,7 +109,7 @@
     <w:p>
       <w:r>
         <w:rPr>
-          <w:rFonts w:ascii="Calibri" w:cs="Calibri"/>
+          <w:rFonts w:ascii="Calibri" w:hAnsi="Calibri" w:eastAsia="Calibri" w:cs="Calibri" w:hAnsiTheme="minorHAnsi" w:eastAsiaTheme="minorHAnsi"/>
           <w:kern w:val="2"/>
           <w:sz w:val="24"/>
           <w:szCs w:val="24"/>
@@ -119,7 +120,7 @@
     <w:p>
       <w:r>
         <w:rPr>
-          <w:rFonts w:ascii="Calibri" w:cs="Calibri"/>
+          <w:rFonts w:ascii="Calibri" w:hAnsi="Calibri" w:eastAsia="Calibri" w:cs="Calibri" w:hAnsiTheme="minorHAnsi" w:eastAsiaTheme="minorHAnsi"/>
           <w:kern w:val="2"/>
           <w:sz w:val="24"/>
           <w:szCs w:val="24"/>
@@ -130,7 +131,7 @@
     <w:p>
       <w:r>
         <w:rPr>
-          <w:rFonts w:ascii="Calibri" w:cs="Calibri"/>
+          <w:rFonts w:ascii="Calibri" w:hAnsi="Calibri" w:eastAsia="Calibri" w:cs="Calibri" w:hAnsiTheme="minorHAnsi" w:eastAsiaTheme="minorHAnsi"/>
           <w:kern w:val="2"/>
           <w:sz w:val="24"/>
           <w:szCs w:val="24"/>
@@ -141,7 +142,7 @@
     <w:p>
       <w:r>
         <w:rPr>
-          <w:rFonts w:ascii="Calibri" w:cs="Calibri"/>
+          <w:rFonts w:ascii="Calibri" w:hAnsi="Calibri" w:eastAsia="Calibri" w:cs="Calibri" w:hAnsiTheme="minorHAnsi" w:eastAsiaTheme="minorHAnsi"/>
           <w:kern w:val="2"/>
           <w:sz w:val="24"/>
           <w:szCs w:val="24"/>
@@ -152,7 +153,7 @@
     <w:p>
       <w:r>
         <w:rPr>
-          <w:rFonts w:ascii="Calibri" w:cs="Calibri"/>
+          <w:rFonts w:ascii="Calibri" w:hAnsi="Calibri" w:eastAsia="Calibri" w:cs="Calibri" w:hAnsiTheme="minorHAnsi" w:eastAsiaTheme="minorHAnsi"/>
           <w:kern w:val="2"/>
           <w:sz w:val="24"/>
           <w:szCs w:val="24"/>
@@ -162,32 +163,73 @@
     </w:p>
     <w:p>
       <w:r>
+        <w:rPr>
+          <w:rFonts w:ascii="Calibri" w:hAnsi="Calibri" w:eastAsia="Calibri" w:cs="Calibri" w:asciiTheme="minorHAnsi" w:hAnsiTheme="minorHAnsi" w:eastAsiaTheme="minorHAnsi" w:csTheme="minorBidi"/>
+          <w:kern w:val="2"/>
+          <w:sz w:val="24"/>
+          <w:szCs w:val="24"/>
+        </w:rPr>
         <w:t>- un owner peut planifier la disponibilit" d'un bien.</w:t>
       </w:r>
     </w:p>
     <w:p>
       <w:r>
+        <w:rPr>
+          <w:rFonts w:ascii="Calibri" w:hAnsi="Calibri" w:eastAsia="Calibri" w:cs="Calibri" w:asciiTheme="minorHAnsi" w:hAnsiTheme="minorHAnsi" w:eastAsiaTheme="minorHAnsi" w:csTheme="minorBidi"/>
+          <w:kern w:val="2"/>
+          <w:sz w:val="24"/>
+          <w:szCs w:val="24"/>
+        </w:rPr>
         <w:t>- Ajouter une colone "Currency" pour definir la devise (echelle internationale) et laissser visible les montant en devise en fonction de la région couverte.</w:t>
       </w:r>
     </w:p>
     <w:p>
       <w:r>
+        <w:rPr>
+          <w:rFonts w:ascii="Calibri" w:hAnsi="Calibri" w:eastAsia="Calibri" w:cs="Calibri" w:asciiTheme="minorHAnsi" w:hAnsiTheme="minorHAnsi" w:eastAsiaTheme="minorHAnsi" w:csTheme="minorBidi"/>
+          <w:kern w:val="2"/>
+          <w:sz w:val="24"/>
+          <w:szCs w:val="24"/>
+        </w:rPr>
         <w:t>- Traduction du cite (bilingue)</w:t>
       </w:r>
     </w:p>
     <w:p>
       <w:r>
+        <w:rPr>
+          <w:rFonts w:ascii="Calibri" w:hAnsi="Calibri" w:eastAsia="Calibri" w:cs="Calibri" w:asciiTheme="minorHAnsi" w:hAnsiTheme="minorHAnsi" w:eastAsiaTheme="minorHAnsi" w:csTheme="minorBidi"/>
+          <w:kern w:val="2"/>
+          <w:sz w:val="24"/>
+          <w:szCs w:val="24"/>
+        </w:rPr>
         <w:t>- Organisé les tables en DB (region, ville, quartier) et filtré les listing en fonction de es éléments</w:t>
       </w:r>
     </w:p>
     <w:p>
       <w:r>
+        <w:rPr>
+          <w:rFonts w:ascii="Calibri" w:hAnsi="Calibri" w:eastAsia="Calibri" w:cs="Calibri" w:asciiTheme="minorHAnsi" w:hAnsiTheme="minorHAnsi" w:eastAsiaTheme="minorHAnsi" w:csTheme="minorBidi"/>
+          <w:kern w:val="2"/>
+          <w:sz w:val="24"/>
+          <w:szCs w:val="24"/>
+        </w:rPr>
         <w:t>- Ajouter l'espace Agent Immobilié à la demande. et mensionner dans la page à pros et aussi dans le pied de page le message ("si vous etes un agent immobilier, contacter nous)</w:t>
       </w:r>
     </w:p>
     <w:p>
       <w:r>
+        <w:rPr>
+          <w:rFonts w:ascii="Calibri" w:hAnsi="Calibri" w:eastAsia="Calibri" w:cs="Calibri" w:asciiTheme="minorHAnsi" w:hAnsiTheme="minorHAnsi" w:eastAsiaTheme="minorHAnsi" w:csTheme="minorBidi"/>
+          <w:kern w:val="2"/>
+          <w:sz w:val="24"/>
+          <w:szCs w:val="24"/>
+        </w:rPr>
         <w:t>- Ajouter un boutton "signaler ce bien" dans la page de détail du listing.</w:t>
+      </w:r>
+    </w:p>
+    <w:p>
+      <w:r>
+        <w:t>- Ajouter les agences prestataire de services de déménagement</w:t>
       </w:r>
     </w:p>
     <w:sectPr>

</xml_diff>